<commit_message>
Final group 1 submission, all changes have been made
</commit_message>
<xml_diff>
--- a/docs/project report.docx
+++ b/docs/project report.docx
@@ -473,7 +473,7 @@
       </w:pPr>
       <w:bookmarkStart w:id="0" w:name="_Hlk176700703"/>
       <w:bookmarkStart w:id="1" w:name="_Toc226196724"/>
-      <w:bookmarkStart w:id="2" w:name="_Toc226201149"/>
+      <w:bookmarkStart w:id="2" w:name="_Toc226394401"/>
       <w:r>
         <w:rPr>
           <w:rFonts w:ascii="Times New Roman" w:hAnsi="Times New Roman"/>
@@ -656,7 +656,7 @@
         </w:rPr>
       </w:pPr>
       <w:bookmarkStart w:id="3" w:name="_Toc226196725"/>
-      <w:bookmarkStart w:id="4" w:name="_Toc226201150"/>
+      <w:bookmarkStart w:id="4" w:name="_Toc226394402"/>
       <w:r>
         <w:rPr>
           <w:rFonts w:ascii="Times New Roman" w:hAnsi="Times New Roman"/>
@@ -756,7 +756,7 @@
           <w:r>
             <w:fldChar w:fldCharType="separate"/>
           </w:r>
-          <w:hyperlink w:anchor="_Toc226201149" w:history="1">
+          <w:hyperlink w:anchor="_Toc226394401" w:history="1">
             <w:r>
               <w:rPr>
                 <w:rStyle w:val="Hyperlink"/>
@@ -785,7 +785,7 @@
                 <w:noProof/>
                 <w:webHidden/>
               </w:rPr>
-              <w:instrText xml:space="preserve"> PAGEREF _Toc226201149 \h </w:instrText>
+              <w:instrText xml:space="preserve"> PAGEREF _Toc226394401 \h </w:instrText>
             </w:r>
             <w:r>
               <w:rPr>
@@ -828,7 +828,7 @@
               <w14:ligatures w14:val="standardContextual"/>
             </w:rPr>
           </w:pPr>
-          <w:hyperlink w:anchor="_Toc226201150" w:history="1">
+          <w:hyperlink w:anchor="_Toc226394402" w:history="1">
             <w:r>
               <w:rPr>
                 <w:rStyle w:val="Hyperlink"/>
@@ -857,7 +857,7 @@
                 <w:noProof/>
                 <w:webHidden/>
               </w:rPr>
-              <w:instrText xml:space="preserve"> PAGEREF _Toc226201150 \h </w:instrText>
+              <w:instrText xml:space="preserve"> PAGEREF _Toc226394402 \h </w:instrText>
             </w:r>
             <w:r>
               <w:rPr>
@@ -900,7 +900,7 @@
               <w14:ligatures w14:val="standardContextual"/>
             </w:rPr>
           </w:pPr>
-          <w:hyperlink w:anchor="_Toc226201151" w:history="1">
+          <w:hyperlink w:anchor="_Toc226394403" w:history="1">
             <w:r>
               <w:rPr>
                 <w:rStyle w:val="Hyperlink"/>
@@ -929,7 +929,7 @@
                 <w:noProof/>
                 <w:webHidden/>
               </w:rPr>
-              <w:instrText xml:space="preserve"> PAGEREF _Toc226201151 \h </w:instrText>
+              <w:instrText xml:space="preserve"> PAGEREF _Toc226394403 \h </w:instrText>
             </w:r>
             <w:r>
               <w:rPr>
@@ -972,7 +972,7 @@
               <w14:ligatures w14:val="standardContextual"/>
             </w:rPr>
           </w:pPr>
-          <w:hyperlink w:anchor="_Toc226201152" w:history="1">
+          <w:hyperlink w:anchor="_Toc226394404" w:history="1">
             <w:r>
               <w:rPr>
                 <w:rStyle w:val="Hyperlink"/>
@@ -1001,7 +1001,7 @@
                 <w:noProof/>
                 <w:webHidden/>
               </w:rPr>
-              <w:instrText xml:space="preserve"> PAGEREF _Toc226201152 \h </w:instrText>
+              <w:instrText xml:space="preserve"> PAGEREF _Toc226394404 \h </w:instrText>
             </w:r>
             <w:r>
               <w:rPr>
@@ -1044,7 +1044,7 @@
               <w14:ligatures w14:val="standardContextual"/>
             </w:rPr>
           </w:pPr>
-          <w:hyperlink w:anchor="_Toc226201153" w:history="1">
+          <w:hyperlink w:anchor="_Toc226394405" w:history="1">
             <w:r>
               <w:rPr>
                 <w:rStyle w:val="Hyperlink"/>
@@ -1073,7 +1073,7 @@
                 <w:noProof/>
                 <w:webHidden/>
               </w:rPr>
-              <w:instrText xml:space="preserve"> PAGEREF _Toc226201153 \h </w:instrText>
+              <w:instrText xml:space="preserve"> PAGEREF _Toc226394405 \h </w:instrText>
             </w:r>
             <w:r>
               <w:rPr>
@@ -1119,7 +1119,7 @@
               <w14:ligatures w14:val="standardContextual"/>
             </w:rPr>
           </w:pPr>
-          <w:hyperlink w:anchor="_Toc226201154" w:history="1">
+          <w:hyperlink w:anchor="_Toc226394406" w:history="1">
             <w:r>
               <w:rPr>
                 <w:rStyle w:val="Hyperlink"/>
@@ -1164,7 +1164,7 @@
                 <w:noProof/>
                 <w:webHidden/>
               </w:rPr>
-              <w:instrText xml:space="preserve"> PAGEREF _Toc226201154 \h </w:instrText>
+              <w:instrText xml:space="preserve"> PAGEREF _Toc226394406 \h </w:instrText>
             </w:r>
             <w:r>
               <w:rPr>
@@ -1207,7 +1207,7 @@
               <w14:ligatures w14:val="standardContextual"/>
             </w:rPr>
           </w:pPr>
-          <w:hyperlink w:anchor="_Toc226201155" w:history="1">
+          <w:hyperlink w:anchor="_Toc226394407" w:history="1">
             <w:r>
               <w:rPr>
                 <w:rStyle w:val="Hyperlink"/>
@@ -1236,7 +1236,7 @@
                 <w:noProof/>
                 <w:webHidden/>
               </w:rPr>
-              <w:instrText xml:space="preserve"> PAGEREF _Toc226201155 \h </w:instrText>
+              <w:instrText xml:space="preserve"> PAGEREF _Toc226394407 \h </w:instrText>
             </w:r>
             <w:r>
               <w:rPr>
@@ -1279,7 +1279,7 @@
               <w14:ligatures w14:val="standardContextual"/>
             </w:rPr>
           </w:pPr>
-          <w:hyperlink w:anchor="_Toc226201156" w:history="1">
+          <w:hyperlink w:anchor="_Toc226394408" w:history="1">
             <w:r>
               <w:rPr>
                 <w:rStyle w:val="Hyperlink"/>
@@ -1308,7 +1308,7 @@
                 <w:noProof/>
                 <w:webHidden/>
               </w:rPr>
-              <w:instrText xml:space="preserve"> PAGEREF _Toc226201156 \h </w:instrText>
+              <w:instrText xml:space="preserve"> PAGEREF _Toc226394408 \h </w:instrText>
             </w:r>
             <w:r>
               <w:rPr>
@@ -1351,13 +1351,13 @@
               <w14:ligatures w14:val="standardContextual"/>
             </w:rPr>
           </w:pPr>
-          <w:hyperlink w:anchor="_Toc226201157" w:history="1">
+          <w:hyperlink w:anchor="_Toc226394409" w:history="1">
             <w:r>
               <w:rPr>
                 <w:rStyle w:val="Hyperlink"/>
                 <w:noProof/>
               </w:rPr>
-              <w:t>2.1 COMPONENTS USED FOR IMPLEMNTING THE PROJECT</w:t>
+              <w:t>2.1 COMPONENTS USED FOR IMPLEMENTING THE PROJECT</w:t>
             </w:r>
             <w:r>
               <w:rPr>
@@ -1378,7 +1378,7 @@
                 <w:noProof/>
                 <w:webHidden/>
               </w:rPr>
-              <w:instrText xml:space="preserve"> PAGEREF _Toc226201157 \h </w:instrText>
+              <w:instrText xml:space="preserve"> PAGEREF _Toc226394409 \h </w:instrText>
             </w:r>
             <w:r>
               <w:rPr>
@@ -1421,7 +1421,7 @@
               <w14:ligatures w14:val="standardContextual"/>
             </w:rPr>
           </w:pPr>
-          <w:hyperlink w:anchor="_Toc226201158" w:history="1">
+          <w:hyperlink w:anchor="_Toc226394410" w:history="1">
             <w:r>
               <w:rPr>
                 <w:rStyle w:val="Hyperlink"/>
@@ -1450,7 +1450,7 @@
                 <w:noProof/>
                 <w:webHidden/>
               </w:rPr>
-              <w:instrText xml:space="preserve"> PAGEREF _Toc226201158 \h </w:instrText>
+              <w:instrText xml:space="preserve"> PAGEREF _Toc226394410 \h </w:instrText>
             </w:r>
             <w:r>
               <w:rPr>
@@ -1493,7 +1493,7 @@
               <w14:ligatures w14:val="standardContextual"/>
             </w:rPr>
           </w:pPr>
-          <w:hyperlink w:anchor="_Toc226201159" w:history="1">
+          <w:hyperlink w:anchor="_Toc226394411" w:history="1">
             <w:r>
               <w:rPr>
                 <w:rStyle w:val="Hyperlink"/>
@@ -1522,7 +1522,7 @@
                 <w:noProof/>
                 <w:webHidden/>
               </w:rPr>
-              <w:instrText xml:space="preserve"> PAGEREF _Toc226201159 \h </w:instrText>
+              <w:instrText xml:space="preserve"> PAGEREF _Toc226394411 \h </w:instrText>
             </w:r>
             <w:r>
               <w:rPr>
@@ -1565,7 +1565,7 @@
               <w14:ligatures w14:val="standardContextual"/>
             </w:rPr>
           </w:pPr>
-          <w:hyperlink w:anchor="_Toc226201160" w:history="1">
+          <w:hyperlink w:anchor="_Toc226394412" w:history="1">
             <w:r>
               <w:rPr>
                 <w:rStyle w:val="Hyperlink"/>
@@ -1594,7 +1594,7 @@
                 <w:noProof/>
                 <w:webHidden/>
               </w:rPr>
-              <w:instrText xml:space="preserve"> PAGEREF _Toc226201160 \h </w:instrText>
+              <w:instrText xml:space="preserve"> PAGEREF _Toc226394412 \h </w:instrText>
             </w:r>
             <w:r>
               <w:rPr>
@@ -1637,7 +1637,7 @@
               <w14:ligatures w14:val="standardContextual"/>
             </w:rPr>
           </w:pPr>
-          <w:hyperlink w:anchor="_Toc226201161" w:history="1">
+          <w:hyperlink w:anchor="_Toc226394413" w:history="1">
             <w:r>
               <w:rPr>
                 <w:rStyle w:val="Hyperlink"/>
@@ -1666,7 +1666,7 @@
                 <w:noProof/>
                 <w:webHidden/>
               </w:rPr>
-              <w:instrText xml:space="preserve"> PAGEREF _Toc226201161 \h </w:instrText>
+              <w:instrText xml:space="preserve"> PAGEREF _Toc226394413 \h </w:instrText>
             </w:r>
             <w:r>
               <w:rPr>
@@ -1796,7 +1796,7 @@
           <w:szCs w:val="28"/>
         </w:rPr>
       </w:pPr>
-      <w:bookmarkStart w:id="6" w:name="_Toc226201151"/>
+      <w:bookmarkStart w:id="6" w:name="_Toc226394403"/>
       <w:r>
         <w:rPr>
           <w:rFonts w:ascii="Times New Roman" w:hAnsi="Times New Roman"/>
@@ -1937,7 +1937,21 @@
           <w:rFonts w:cs="FreeSans"/>
           <w:szCs w:val="24"/>
         </w:rPr>
-        <w:t>……………...…………………………………</w:t>
+        <w:t>……………...………………………………</w:t>
+      </w:r>
+      <w:r>
+        <w:rPr>
+          <w:rFonts w:cs="FreeSans"/>
+          <w:szCs w:val="24"/>
+        </w:rPr>
+        <w:t>.</w:t>
+      </w:r>
+      <w:r>
+        <w:rPr>
+          <w:rFonts w:cs="FreeSans"/>
+          <w:szCs w:val="24"/>
+        </w:rPr>
+        <w:t>…</w:t>
       </w:r>
       <w:r>
         <w:rPr>
@@ -2193,7 +2207,7 @@
         </w:rPr>
       </w:pPr>
       <w:bookmarkStart w:id="7" w:name="_Toc226196728"/>
-      <w:bookmarkStart w:id="8" w:name="_Toc226201152"/>
+      <w:bookmarkStart w:id="8" w:name="_Toc226394404"/>
       <w:r>
         <w:rPr>
           <w:rFonts w:ascii="Times New Roman" w:hAnsi="Times New Roman"/>
@@ -2222,7 +2236,7 @@
         </w:rPr>
       </w:pPr>
       <w:bookmarkStart w:id="9" w:name="_Toc226196729"/>
-      <w:bookmarkStart w:id="10" w:name="_Toc226201153"/>
+      <w:bookmarkStart w:id="10" w:name="_Toc226394405"/>
       <w:r>
         <w:rPr>
           <w:rFonts w:ascii="Times New Roman" w:hAnsi="Times New Roman"/>
@@ -2248,7 +2262,7 @@
           <w:szCs w:val="24"/>
         </w:rPr>
       </w:pPr>
-      <w:bookmarkStart w:id="11" w:name="_Toc226201154"/>
+      <w:bookmarkStart w:id="11" w:name="_Toc226394406"/>
       <w:r>
         <w:rPr>
           <w:szCs w:val="24"/>
@@ -2260,7 +2274,13 @@
     <w:p>
       <w:bookmarkStart w:id="12" w:name="_Toc226196731"/>
       <w:r>
-        <w:t>Traditional methods of plant irrigation, such as manual watering or fixed-timer systems, are often inefficient and labour-intensive. These methods do not account for real-time soil conditions, frequently leading to water wastage through over-irrigation or crop stress due to under-watering. Furthermore, many gardening environments lack easy access to the electrical grid, necessitating a self-sustaining power solution.This project addresses these challenges by designing and implementing a Solar-Powered Automatic Plant Watering System controlled by an Arduino microcontroller.</w:t>
+        <w:t xml:space="preserve">Traditional methods of plant irrigation, such as manual watering or fixed-timer systems, are often inefficient and labour-intensive. These methods do not account for real-time soil conditions, frequently leading to water wastage through over-irrigation or crop stress due to under-watering. Furthermore, many gardening environments lack easy access to the electrical grid, necessitating a self-sustaining power </w:t>
+      </w:r>
+      <w:r>
+        <w:t>solution. This</w:t>
+      </w:r>
+      <w:r>
+        <w:t xml:space="preserve"> project addresses these challenges by designing and implementing a Solar-Powered Automatic Plant Watering System controlled by an Arduino microcontroller.</w:t>
       </w:r>
     </w:p>
     <w:p>
@@ -2442,7 +2462,7 @@
         </w:rPr>
       </w:pPr>
       <w:bookmarkStart w:id="13" w:name="_Toc226196733"/>
-      <w:bookmarkStart w:id="14" w:name="_Toc226201155"/>
+      <w:bookmarkStart w:id="14" w:name="_Toc226394407"/>
       <w:r>
         <w:rPr>
           <w:rFonts w:ascii="Times New Roman" w:hAnsi="Times New Roman"/>
@@ -2471,7 +2491,7 @@
         </w:rPr>
       </w:pPr>
       <w:bookmarkStart w:id="15" w:name="_Toc226196734"/>
-      <w:bookmarkStart w:id="16" w:name="_Toc226201156"/>
+      <w:bookmarkStart w:id="16" w:name="_Toc226394408"/>
       <w:r>
         <w:rPr>
           <w:rFonts w:ascii="Times New Roman" w:hAnsi="Times New Roman"/>
@@ -2494,7 +2514,7 @@
         </w:rPr>
       </w:pPr>
       <w:bookmarkStart w:id="17" w:name="_Toc226196735"/>
-      <w:bookmarkStart w:id="18" w:name="_Toc226201157"/>
+      <w:bookmarkStart w:id="18" w:name="_Toc226394409"/>
       <w:r>
         <w:rPr>
           <w:szCs w:val="24"/>
@@ -2506,7 +2526,19 @@
         <w:rPr>
           <w:szCs w:val="24"/>
         </w:rPr>
-        <w:t>COMPONENTS USED FOR IMPLEMNTING THE PROJECT</w:t>
+        <w:t>COMPONENTS USED FOR IMPLEM</w:t>
+      </w:r>
+      <w:r>
+        <w:rPr>
+          <w:szCs w:val="24"/>
+        </w:rPr>
+        <w:t>E</w:t>
+      </w:r>
+      <w:r>
+        <w:rPr>
+          <w:szCs w:val="24"/>
+        </w:rPr>
+        <w:t>NTING THE PROJECT</w:t>
       </w:r>
       <w:bookmarkEnd w:id="18"/>
     </w:p>
@@ -2534,9 +2566,9 @@
           <w:noProof/>
         </w:rPr>
         <w:drawing>
-          <wp:inline distT="0" distB="0" distL="0" distR="0" wp14:anchorId="596674A0" wp14:editId="30A12CA0">
-            <wp:extent cx="3948430" cy="3179445"/>
-            <wp:effectExtent l="0" t="0" r="0" b="1905"/>
+          <wp:inline distT="0" distB="0" distL="0" distR="0" wp14:anchorId="596674A0" wp14:editId="1D9EB5C6">
+            <wp:extent cx="3406140" cy="2742770"/>
+            <wp:effectExtent l="0" t="0" r="3810" b="635"/>
             <wp:docPr id="267096659" name="Picture 1"/>
             <wp:cNvGraphicFramePr>
               <a:graphicFrameLocks xmlns:a="http://schemas.openxmlformats.org/drawingml/2006/main" noChangeAspect="1"/>
@@ -2566,7 +2598,7 @@
                   <pic:spPr bwMode="auto">
                     <a:xfrm>
                       <a:off x="0" y="0"/>
-                      <a:ext cx="3948430" cy="3179445"/>
+                      <a:ext cx="3410508" cy="2746287"/>
                     </a:xfrm>
                     <a:prstGeom prst="rect">
                       <a:avLst/>
@@ -2590,14 +2622,27 @@
       <w:r>
         <w:t xml:space="preserve">                           Figure </w:t>
       </w:r>
-      <w:fldSimple w:instr=" SEQ Figure \* ARABIC ">
-        <w:r>
-          <w:rPr>
-            <w:noProof/>
-          </w:rPr>
-          <w:t>1</w:t>
-        </w:r>
-      </w:fldSimple>
+      <w:r>
+        <w:fldChar w:fldCharType="begin"/>
+      </w:r>
+      <w:r>
+        <w:instrText xml:space="preserve"> SEQ Figure \* ARABIC </w:instrText>
+      </w:r>
+      <w:r>
+        <w:fldChar w:fldCharType="separate"/>
+      </w:r>
+      <w:r>
+        <w:rPr>
+          <w:noProof/>
+        </w:rPr>
+        <w:t>1</w:t>
+      </w:r>
+      <w:r>
+        <w:rPr>
+          <w:noProof/>
+        </w:rPr>
+        <w:fldChar w:fldCharType="end"/>
+      </w:r>
       <w:r>
         <w:t xml:space="preserve"> Arduino Uno microcontroller</w:t>
       </w:r>
@@ -2681,14 +2726,27 @@
       <w:r>
         <w:t xml:space="preserve">              Figure </w:t>
       </w:r>
-      <w:fldSimple w:instr=" SEQ Figure \* ARABIC ">
-        <w:r>
-          <w:rPr>
-            <w:noProof/>
-          </w:rPr>
-          <w:t>2</w:t>
-        </w:r>
-      </w:fldSimple>
+      <w:r>
+        <w:fldChar w:fldCharType="begin"/>
+      </w:r>
+      <w:r>
+        <w:instrText xml:space="preserve"> SEQ Figure \* ARABIC </w:instrText>
+      </w:r>
+      <w:r>
+        <w:fldChar w:fldCharType="separate"/>
+      </w:r>
+      <w:r>
+        <w:rPr>
+          <w:noProof/>
+        </w:rPr>
+        <w:t>2</w:t>
+      </w:r>
+      <w:r>
+        <w:rPr>
+          <w:noProof/>
+        </w:rPr>
+        <w:fldChar w:fldCharType="end"/>
+      </w:r>
       <w:r>
         <w:t xml:space="preserve"> Soil moisture sensor</w:t>
       </w:r>
@@ -2722,7 +2780,7 @@
         </w:rPr>
         <w:lastRenderedPageBreak/>
         <w:drawing>
-          <wp:inline distT="0" distB="0" distL="0" distR="0" wp14:anchorId="35DC3E38" wp14:editId="67702CBB">
+          <wp:inline distT="0" distB="0" distL="0" distR="0" wp14:anchorId="35DC3E38" wp14:editId="43836988">
             <wp:extent cx="1900115" cy="1960418"/>
             <wp:effectExtent l="0" t="0" r="5080" b="1905"/>
             <wp:docPr id="924719701" name="Picture 3"/>
@@ -2778,14 +2836,27 @@
       <w:r>
         <w:t xml:space="preserve">                      Figure </w:t>
       </w:r>
-      <w:fldSimple w:instr=" SEQ Figure \* ARABIC ">
-        <w:r>
-          <w:rPr>
-            <w:noProof/>
-          </w:rPr>
-          <w:t>3</w:t>
-        </w:r>
-      </w:fldSimple>
+      <w:r>
+        <w:fldChar w:fldCharType="begin"/>
+      </w:r>
+      <w:r>
+        <w:instrText xml:space="preserve"> SEQ Figure \* ARABIC </w:instrText>
+      </w:r>
+      <w:r>
+        <w:fldChar w:fldCharType="separate"/>
+      </w:r>
+      <w:r>
+        <w:rPr>
+          <w:noProof/>
+        </w:rPr>
+        <w:t>3</w:t>
+      </w:r>
+      <w:r>
+        <w:rPr>
+          <w:noProof/>
+        </w:rPr>
+        <w:fldChar w:fldCharType="end"/>
+      </w:r>
       <w:r>
         <w:t xml:space="preserve"> Pv panel</w:t>
       </w:r>
@@ -2808,7 +2879,10 @@
         <w:pStyle w:val="ListParagraph"/>
       </w:pPr>
       <w:r>
-        <w:t>5. Breadboard</w:t>
+        <w:t xml:space="preserve">5. </w:t>
+      </w:r>
+      <w:r>
+        <w:t>Relay</w:t>
       </w:r>
     </w:p>
     <w:p>
@@ -2832,6 +2906,14 @@
     </w:p>
     <w:p>
       <w:pPr>
+        <w:pStyle w:val="ListParagraph"/>
+      </w:pPr>
+      <w:r>
+        <w:t>8. Push buttons</w:t>
+      </w:r>
+    </w:p>
+    <w:p>
+      <w:pPr>
         <w:rPr>
           <w:szCs w:val="24"/>
         </w:rPr>
@@ -2853,9 +2935,9 @@
           <w:szCs w:val="24"/>
         </w:rPr>
         <w:drawing>
-          <wp:inline distT="0" distB="0" distL="0" distR="0" wp14:anchorId="1E4FB8CF" wp14:editId="41E2B40B">
-            <wp:extent cx="5198240" cy="3934691"/>
-            <wp:effectExtent l="0" t="0" r="2540" b="8890"/>
+          <wp:inline distT="0" distB="0" distL="0" distR="0" wp14:anchorId="1E4FB8CF" wp14:editId="0EB887EF">
+            <wp:extent cx="3754988" cy="3345180"/>
+            <wp:effectExtent l="0" t="0" r="0" b="7620"/>
             <wp:docPr id="1022418800" name="Picture 4"/>
             <wp:cNvGraphicFramePr>
               <a:graphicFrameLocks xmlns:a="http://schemas.openxmlformats.org/drawingml/2006/main" noChangeAspect="1"/>
@@ -2864,7 +2946,7 @@
               <a:graphicData uri="http://schemas.openxmlformats.org/drawingml/2006/picture">
                 <pic:pic xmlns:pic="http://schemas.openxmlformats.org/drawingml/2006/picture">
                   <pic:nvPicPr>
-                    <pic:cNvPr id="0" name="Picture 4"/>
+                    <pic:cNvPr id="1022418800" name="Picture 4"/>
                     <pic:cNvPicPr>
                       <a:picLocks noChangeAspect="1" noChangeArrowheads="1"/>
                     </pic:cNvPicPr>
@@ -2877,7 +2959,6 @@
                         </a:ext>
                       </a:extLst>
                     </a:blip>
-                    <a:srcRect/>
                     <a:stretch>
                       <a:fillRect/>
                     </a:stretch>
@@ -2885,7 +2966,7 @@
                   <pic:spPr bwMode="auto">
                     <a:xfrm>
                       <a:off x="0" y="0"/>
-                      <a:ext cx="5203633" cy="3938773"/>
+                      <a:ext cx="3758743" cy="3348525"/>
                     </a:xfrm>
                     <a:prstGeom prst="rect">
                       <a:avLst/>
@@ -2909,14 +2990,27 @@
       <w:r>
         <w:t xml:space="preserve">Figure </w:t>
       </w:r>
-      <w:fldSimple w:instr=" SEQ Figure \* ARABIC ">
-        <w:r>
-          <w:rPr>
-            <w:noProof/>
-          </w:rPr>
-          <w:t>4</w:t>
-        </w:r>
-      </w:fldSimple>
+      <w:r>
+        <w:fldChar w:fldCharType="begin"/>
+      </w:r>
+      <w:r>
+        <w:instrText xml:space="preserve"> SEQ Figure \* ARABIC </w:instrText>
+      </w:r>
+      <w:r>
+        <w:fldChar w:fldCharType="separate"/>
+      </w:r>
+      <w:r>
+        <w:rPr>
+          <w:noProof/>
+        </w:rPr>
+        <w:t>4</w:t>
+      </w:r>
+      <w:r>
+        <w:rPr>
+          <w:noProof/>
+        </w:rPr>
+        <w:fldChar w:fldCharType="end"/>
+      </w:r>
       <w:r>
         <w:t xml:space="preserve"> Wiring connections</w:t>
       </w:r>
@@ -2937,8 +3031,19 @@
         <w:rPr>
           <w:rFonts w:cs="Times New Roman"/>
         </w:rPr>
-        <w:lastRenderedPageBreak/>
-        <w:t>The entire project was designed and implemented in tikercad, the circuit connections is shown in the picture above.</w:t>
+        <w:t>The entire project was designed and implemented in ti</w:t>
+      </w:r>
+      <w:r>
+        <w:rPr>
+          <w:rFonts w:cs="Times New Roman"/>
+        </w:rPr>
+        <w:t>n</w:t>
+      </w:r>
+      <w:r>
+        <w:rPr>
+          <w:rFonts w:cs="Times New Roman"/>
+        </w:rPr>
+        <w:t>kercad, the circuit connections is shown in the picture above.</w:t>
       </w:r>
     </w:p>
     <w:p>
@@ -2957,19 +3062,38 @@
         <w:rPr>
           <w:rFonts w:cs="Times New Roman"/>
         </w:rPr>
-        <w:t>The soil moisture sensor’s analog output is connected to A0 on the Arduino.</w:t>
+        <w:lastRenderedPageBreak/>
+        <w:t xml:space="preserve">The soil moisture sensor’s </w:t>
+      </w:r>
+      <w:r>
+        <w:rPr>
+          <w:rFonts w:cs="Times New Roman"/>
+        </w:rPr>
+        <w:t>analogue</w:t>
+      </w:r>
+      <w:r>
+        <w:rPr>
+          <w:rFonts w:cs="Times New Roman"/>
+        </w:rPr>
+        <w:t xml:space="preserve"> output is connected to A0 on the Arduino</w:t>
+      </w:r>
+      <w:r>
+        <w:rPr>
+          <w:rFonts w:cs="Times New Roman"/>
+        </w:rPr>
+        <w:t xml:space="preserve"> and is used to receive voltage signals corresponding to soil moisture level</w:t>
+      </w:r>
+      <w:r>
+        <w:rPr>
+          <w:rFonts w:cs="Times New Roman"/>
+        </w:rPr>
+        <w:t>.</w:t>
       </w:r>
       <w:r>
         <w:rPr>
           <w:rFonts w:cs="Times New Roman"/>
         </w:rPr>
         <w:t xml:space="preserve"> </w:t>
-      </w:r>
-      <w:r>
-        <w:rPr>
-          <w:rFonts w:cs="Times New Roman"/>
-        </w:rPr>
-        <w:t xml:space="preserve">Digital pin 8 controls power to the sensor (turned ON only during reading to prevent corrosion). </w:t>
       </w:r>
     </w:p>
     <w:p>
@@ -2988,7 +3112,25 @@
         <w:rPr>
           <w:rFonts w:cs="Times New Roman"/>
         </w:rPr>
-        <w:t xml:space="preserve">LEDs: Red (Pin 2 – Dry), Yellow (Pin 3 – Optimal), Blue (Pin 4 – Wet). </w:t>
+        <w:t>Water pump is controlled via</w:t>
+      </w:r>
+      <w:r>
+        <w:rPr>
+          <w:rFonts w:cs="Times New Roman"/>
+        </w:rPr>
+        <w:t xml:space="preserve"> relay </w:t>
+      </w:r>
+      <w:r>
+        <w:rPr>
+          <w:rFonts w:cs="Times New Roman"/>
+        </w:rPr>
+        <w:t>using analogue pin 9 by controlling the power from the solar pv to the motor pump.</w:t>
+      </w:r>
+      <w:r>
+        <w:rPr>
+          <w:rFonts w:cs="Times New Roman"/>
+        </w:rPr>
+        <w:t xml:space="preserve"> </w:t>
       </w:r>
     </w:p>
     <w:p>
@@ -3007,7 +3149,7 @@
         <w:rPr>
           <w:rFonts w:cs="Times New Roman"/>
         </w:rPr>
-        <w:t xml:space="preserve">Water pump is controlled via Pin 11. </w:t>
+        <w:t>The push buttons whose input are received at digital pins A3, A4 and A5 are used to regulate the threshold value in the EEPROM of the microcontroller. Push button 1 increases the threshold value by 1, push button 2 reduces the threshold value by 1 and push button 3 resets the original threshold value.</w:t>
       </w:r>
     </w:p>
     <w:p>
@@ -3026,7 +3168,57 @@
         <w:rPr>
           <w:rFonts w:cs="Times New Roman"/>
         </w:rPr>
-        <w:t>Solar panel and battery supply power to the Arduino and pump circuit.</w:t>
+        <w:t>The LCD displays information about the system status. It shows when the pump is on/off, it also displays the moisture percentage. A potentiometer is connected to the LCD for the convenience of controlling display brightness.</w:t>
+      </w:r>
+    </w:p>
+    <w:p>
+      <w:pPr>
+        <w:pStyle w:val="ListContents"/>
+        <w:numPr>
+          <w:ilvl w:val="0"/>
+          <w:numId w:val="0"/>
+        </w:numPr>
+        <w:ind w:left="720"/>
+        <w:rPr>
+          <w:rFonts w:cs="Times New Roman"/>
+        </w:rPr>
+      </w:pPr>
+      <w:r>
+        <w:rPr>
+          <w:rFonts w:cs="Times New Roman"/>
+        </w:rPr>
+        <w:t xml:space="preserve">Solar panel </w:t>
+      </w:r>
+      <w:r>
+        <w:rPr>
+          <w:rFonts w:cs="Times New Roman"/>
+        </w:rPr>
+        <w:t>is used to drive the water pump, the microcontroller, Arduino in this situation controls the</w:t>
+      </w:r>
+      <w:r>
+        <w:rPr>
+          <w:rFonts w:cs="Times New Roman"/>
+        </w:rPr>
+        <w:t xml:space="preserve"> how much the pump delivers water to the soil.</w:t>
+      </w:r>
+    </w:p>
+    <w:p>
+      <w:pPr>
+        <w:pStyle w:val="ListContents"/>
+        <w:numPr>
+          <w:ilvl w:val="0"/>
+          <w:numId w:val="0"/>
+        </w:numPr>
+        <w:ind w:left="720"/>
+        <w:rPr>
+          <w:rFonts w:cs="Times New Roman"/>
+        </w:rPr>
+      </w:pPr>
+      <w:r>
+        <w:rPr>
+          <w:rFonts w:cs="Times New Roman"/>
+        </w:rPr>
+        <w:t>The voltmeter is used to display how much energy is generated from the solar pv.</w:t>
       </w:r>
     </w:p>
     <w:p>
@@ -3080,7 +3272,14 @@
           <w:szCs w:val="24"/>
           <w:lang w:val="en-US"/>
         </w:rPr>
-        <w:t>Dry soil simulation triggered the pump and Red LED correctly.</w:t>
+        <w:t xml:space="preserve">Dry soil simulation triggered the pump </w:t>
+      </w:r>
+      <w:r>
+        <w:rPr>
+          <w:szCs w:val="24"/>
+          <w:lang w:val="en-US"/>
+        </w:rPr>
+        <w:t xml:space="preserve">to turn on. </w:t>
       </w:r>
     </w:p>
     <w:p>
@@ -3099,7 +3298,14 @@
           <w:szCs w:val="24"/>
           <w:lang w:val="en-US"/>
         </w:rPr>
-        <w:t>Adding “water” (changing sensor value) turned the pump OFF and activated the Yellow or Blue LED.</w:t>
+        <w:t>Adding “water” (changing sensor value) turned the pump OFF</w:t>
+      </w:r>
+      <w:r>
+        <w:rPr>
+          <w:szCs w:val="24"/>
+          <w:lang w:val="en-US"/>
+        </w:rPr>
+        <w:t>.</w:t>
       </w:r>
     </w:p>
     <w:p>
@@ -3118,81 +3324,56 @@
           <w:szCs w:val="24"/>
           <w:lang w:val="en-US"/>
         </w:rPr>
-        <w:t>The solar panel successfully powered the circuit in the simulation.</w:t>
-      </w:r>
-    </w:p>
-    <w:p>
-      <w:pPr>
+        <w:t xml:space="preserve">The solar panel successfully powered the </w:t>
+      </w:r>
+      <w:r>
         <w:rPr>
           <w:szCs w:val="24"/>
           <w:lang w:val="en-US"/>
         </w:rPr>
-      </w:pPr>
+        <w:t xml:space="preserve">circuit </w:t>
+      </w:r>
       <w:r>
         <w:rPr>
           <w:szCs w:val="24"/>
           <w:lang w:val="en-US"/>
         </w:rPr>
-        <w:t>The thresholds may need real-world calibration depending on soil type and sensor variation. The sensor power control technique helps prolong the life of the moisture sensor.</w:t>
-      </w:r>
-    </w:p>
-    <w:p>
-      <w:pPr>
-        <w:rPr>
-          <w:szCs w:val="24"/>
-        </w:rPr>
-      </w:pPr>
-    </w:p>
-    <w:p>
-      <w:pPr>
-        <w:rPr>
-          <w:szCs w:val="24"/>
-        </w:rPr>
-      </w:pPr>
-    </w:p>
-    <w:p>
-      <w:pPr>
-        <w:rPr>
-          <w:szCs w:val="24"/>
-        </w:rPr>
-      </w:pPr>
-    </w:p>
-    <w:p>
-      <w:pPr>
-        <w:rPr>
-          <w:szCs w:val="24"/>
-        </w:rPr>
-      </w:pPr>
-    </w:p>
-    <w:p>
-      <w:pPr>
-        <w:rPr>
-          <w:szCs w:val="24"/>
-        </w:rPr>
-      </w:pPr>
-    </w:p>
-    <w:p>
-      <w:pPr>
-        <w:rPr>
-          <w:szCs w:val="24"/>
-        </w:rPr>
-      </w:pPr>
-    </w:p>
-    <w:p>
-      <w:pPr>
-        <w:rPr>
-          <w:rFonts w:cs="Times New Roman"/>
-          <w:sz w:val="28"/>
-          <w:szCs w:val="28"/>
-        </w:rPr>
-      </w:pPr>
-    </w:p>
-    <w:p>
-      <w:pPr>
-        <w:rPr>
-          <w:rFonts w:cs="Times New Roman"/>
-          <w:sz w:val="28"/>
-          <w:szCs w:val="28"/>
+        <w:t>in the simulation.</w:t>
+      </w:r>
+    </w:p>
+    <w:p>
+      <w:pPr>
+        <w:rPr>
+          <w:szCs w:val="24"/>
+          <w:lang w:val="en-US"/>
+        </w:rPr>
+      </w:pPr>
+      <w:r>
+        <w:rPr>
+          <w:szCs w:val="24"/>
+          <w:lang w:val="en-US"/>
+        </w:rPr>
+        <w:t xml:space="preserve">The thresholds may need real-world calibration depending on soil type and sensor variation. </w:t>
+      </w:r>
+    </w:p>
+    <w:p>
+      <w:pPr>
+        <w:rPr>
+          <w:szCs w:val="24"/>
+        </w:rPr>
+      </w:pPr>
+    </w:p>
+    <w:p>
+      <w:pPr>
+        <w:rPr>
+          <w:szCs w:val="24"/>
+        </w:rPr>
+      </w:pPr>
+    </w:p>
+    <w:p>
+      <w:pPr>
+        <w:rPr>
+          <w:szCs w:val="24"/>
         </w:rPr>
       </w:pPr>
     </w:p>
@@ -3207,7 +3388,7 @@
           <w:szCs w:val="30"/>
         </w:rPr>
       </w:pPr>
-      <w:bookmarkStart w:id="19" w:name="_Toc226201158"/>
+      <w:bookmarkStart w:id="19" w:name="_Toc226394410"/>
       <w:r>
         <w:rPr>
           <w:rFonts w:ascii="Times New Roman" w:hAnsi="Times New Roman"/>
@@ -3231,7 +3412,7 @@
           <w:szCs w:val="28"/>
         </w:rPr>
       </w:pPr>
-      <w:bookmarkStart w:id="20" w:name="_Toc226201159"/>
+      <w:bookmarkStart w:id="20" w:name="_Toc226394411"/>
       <w:r>
         <w:rPr>
           <w:rFonts w:ascii="Times New Roman" w:hAnsi="Times New Roman"/>
@@ -3408,7 +3589,7 @@
           <w:szCs w:val="30"/>
         </w:rPr>
       </w:pPr>
-      <w:bookmarkStart w:id="21" w:name="_Toc226201160"/>
+      <w:bookmarkStart w:id="21" w:name="_Toc226394412"/>
       <w:r>
         <w:rPr>
           <w:rFonts w:ascii="Times New Roman" w:hAnsi="Times New Roman"/>
@@ -3427,7 +3608,7 @@
         <w:pStyle w:val="Heading1"/>
         <w:jc w:val="center"/>
       </w:pPr>
-      <w:bookmarkStart w:id="22" w:name="_Toc226201161"/>
+      <w:bookmarkStart w:id="22" w:name="_Toc226394413"/>
       <w:r>
         <w:rPr>
           <w:rFonts w:ascii="Times New Roman" w:hAnsi="Times New Roman"/>
@@ -3446,10 +3627,29 @@
     </w:p>
     <w:p>
       <w:pPr>
+        <w:rPr>
+          <w:szCs w:val="24"/>
+          <w:lang w:val="en-US"/>
+        </w:rPr>
+      </w:pPr>
+      <w:r>
+        <w:rPr>
+          <w:szCs w:val="24"/>
+          <w:lang w:val="en-US"/>
+        </w:rPr>
+        <w:t>For future improvements and real-world implementation, the following are recommended:</w:t>
+      </w:r>
+    </w:p>
+    <w:p>
+      <w:pPr>
+        <w:pStyle w:val="ListParagraph"/>
         <w:numPr>
           <w:ilvl w:val="0"/>
-          <w:numId w:val="22"/>
+          <w:numId w:val="34"/>
         </w:numPr>
+        <w:tabs>
+          <w:tab w:val="left" w:pos="1244"/>
+        </w:tabs>
         <w:rPr>
           <w:szCs w:val="24"/>
           <w:lang w:val="en-US"/>
@@ -3460,15 +3660,35 @@
           <w:szCs w:val="24"/>
           <w:lang w:val="en-US"/>
         </w:rPr>
-        <w:t>For future improvements and real-world implementation, the following are recommended:</w:t>
-      </w:r>
-    </w:p>
-    <w:p>
-      <w:pPr>
+        <w:t xml:space="preserve">Capacitive Sensor Upgrade: Replaces resistive probes with </w:t>
+      </w:r>
+      <w:r>
+        <w:rPr>
+          <w:b/>
+          <w:bCs/>
+          <w:szCs w:val="24"/>
+          <w:lang w:val="en-US"/>
+        </w:rPr>
+        <w:t>capacitive sensors</w:t>
+      </w:r>
+      <w:r>
+        <w:rPr>
+          <w:szCs w:val="24"/>
+          <w:lang w:val="en-US"/>
+        </w:rPr>
+        <w:t xml:space="preserve"> to eliminate corrosion and ensure long-term hardware reliability.</w:t>
+      </w:r>
+    </w:p>
+    <w:p>
+      <w:pPr>
+        <w:pStyle w:val="ListParagraph"/>
         <w:numPr>
           <w:ilvl w:val="0"/>
-          <w:numId w:val="22"/>
+          <w:numId w:val="32"/>
         </w:numPr>
+        <w:tabs>
+          <w:tab w:val="left" w:pos="1244"/>
+        </w:tabs>
         <w:rPr>
           <w:szCs w:val="24"/>
           <w:lang w:val="en-US"/>
@@ -3479,15 +3699,19 @@
           <w:szCs w:val="24"/>
           <w:lang w:val="en-US"/>
         </w:rPr>
-        <w:t>Integrate a small LCD or OLED display to show moisture percentage and status.</w:t>
-      </w:r>
-    </w:p>
-    <w:p>
-      <w:pPr>
+        <w:t>Water Reservoir Protection: Integrates an ultrasonic or float sensor to automatically disable the pump if the water tank is empty, preventing motor burnout.</w:t>
+      </w:r>
+    </w:p>
+    <w:p>
+      <w:pPr>
+        <w:pStyle w:val="ListParagraph"/>
         <w:numPr>
           <w:ilvl w:val="0"/>
-          <w:numId w:val="22"/>
+          <w:numId w:val="32"/>
         </w:numPr>
+        <w:tabs>
+          <w:tab w:val="left" w:pos="1244"/>
+        </w:tabs>
         <w:rPr>
           <w:szCs w:val="24"/>
           <w:lang w:val="en-US"/>
@@ -3498,15 +3722,19 @@
           <w:szCs w:val="24"/>
           <w:lang w:val="en-US"/>
         </w:rPr>
-        <w:t>Add a water level sensor for the reservoir to prevent the pump from running dry.</w:t>
-      </w:r>
-    </w:p>
-    <w:p>
-      <w:pPr>
+        <w:t>Deep Sleep Power Management: Programs the Arduino to enter a low-power "sleep" state between readings, significantly extending battery life during cloudy periods.</w:t>
+      </w:r>
+    </w:p>
+    <w:p>
+      <w:pPr>
+        <w:pStyle w:val="ListParagraph"/>
         <w:numPr>
           <w:ilvl w:val="0"/>
-          <w:numId w:val="22"/>
+          <w:numId w:val="32"/>
         </w:numPr>
+        <w:tabs>
+          <w:tab w:val="left" w:pos="1244"/>
+        </w:tabs>
         <w:rPr>
           <w:szCs w:val="24"/>
           <w:lang w:val="en-US"/>
@@ -3517,91 +3745,43 @@
           <w:szCs w:val="24"/>
           <w:lang w:val="en-US"/>
         </w:rPr>
-        <w:t>Implement hysteresis in the code to avoid rapid pump switching.</w:t>
-      </w:r>
-    </w:p>
-    <w:p>
-      <w:pPr>
+        <w:t>Weather Intelligence (DHT11/22): Adds a temperature and humidity sensor to adjust watering volumes based on heat and evaporation rates.</w:t>
+      </w:r>
+    </w:p>
+    <w:p>
+      <w:pPr>
+        <w:pStyle w:val="ListParagraph"/>
         <w:numPr>
           <w:ilvl w:val="0"/>
-          <w:numId w:val="22"/>
+          <w:numId w:val="32"/>
         </w:numPr>
+        <w:tabs>
+          <w:tab w:val="left" w:pos="1244"/>
+        </w:tabs>
+      </w:pPr>
+      <w:r>
         <w:rPr>
           <w:szCs w:val="24"/>
           <w:lang w:val="en-US"/>
         </w:rPr>
-      </w:pPr>
-      <w:r>
-        <w:rPr>
+        <w:t xml:space="preserve">IoT Remote Monitoring: Upgrades the controller to an </w:t>
+      </w:r>
+      <w:r>
+        <w:rPr>
+          <w:b/>
+          <w:bCs/>
           <w:szCs w:val="24"/>
           <w:lang w:val="en-US"/>
         </w:rPr>
-        <w:t>Replace the simulation with a physical prototype using a relay module for the pump.</w:t>
-      </w:r>
-    </w:p>
-    <w:p>
-      <w:pPr>
-        <w:numPr>
-          <w:ilvl w:val="0"/>
-          <w:numId w:val="22"/>
-        </w:numPr>
+        <w:t>ESP32 or ESP8266</w:t>
+      </w:r>
+      <w:r>
         <w:rPr>
           <w:szCs w:val="24"/>
           <w:lang w:val="en-US"/>
         </w:rPr>
-      </w:pPr>
-      <w:r>
-        <w:rPr>
-          <w:szCs w:val="24"/>
-          <w:lang w:val="en-US"/>
-        </w:rPr>
-        <w:t>Add Wi-Fi (ESP8266/ESP32) for remote monitoring via a mobile app.</w:t>
-      </w:r>
-    </w:p>
-    <w:p>
-      <w:pPr>
-        <w:numPr>
-          <w:ilvl w:val="0"/>
-          <w:numId w:val="22"/>
-        </w:numPr>
-        <w:rPr>
-          <w:szCs w:val="24"/>
-          <w:lang w:val="en-US"/>
-        </w:rPr>
-      </w:pPr>
-      <w:r>
-        <w:rPr>
-          <w:szCs w:val="24"/>
-          <w:lang w:val="en-US"/>
-        </w:rPr>
-        <w:t>Use a larger solar panel and battery for outdoor field applications.</w:t>
-      </w:r>
-    </w:p>
-    <w:p>
-      <w:pPr>
-        <w:numPr>
-          <w:ilvl w:val="0"/>
-          <w:numId w:val="22"/>
-        </w:numPr>
-        <w:rPr>
-          <w:szCs w:val="24"/>
-          <w:lang w:val="en-US"/>
-        </w:rPr>
-      </w:pPr>
-      <w:r>
-        <w:rPr>
-          <w:szCs w:val="24"/>
-          <w:lang w:val="en-US"/>
-        </w:rPr>
-        <w:t>Calibrate the sensor thoroughly in different soil types before deployment.</w:t>
-      </w:r>
-    </w:p>
-    <w:p>
-      <w:pPr>
-        <w:tabs>
-          <w:tab w:val="left" w:pos="1244"/>
-        </w:tabs>
-      </w:pPr>
+        <w:t xml:space="preserve"> to allow real-time moisture tracking and manual pump control via a smartphone app.</w:t>
+      </w:r>
     </w:p>
     <w:sectPr>
       <w:footerReference w:type="default" r:id="rId13"/>
@@ -4708,6 +4888,119 @@
     </w:lvl>
   </w:abstractNum>
   <w:abstractNum w:abstractNumId="8" w15:restartNumberingAfterBreak="0">
+    <w:nsid w:val="1AE027C3"/>
+    <w:multiLevelType w:val="hybridMultilevel"/>
+    <w:tmpl w:val="51D49F38"/>
+    <w:lvl w:ilvl="0" w:tplc="04090001">
+      <w:start w:val="1"/>
+      <w:numFmt w:val="bullet"/>
+      <w:lvlText w:val=""/>
+      <w:lvlJc w:val="left"/>
+      <w:pPr>
+        <w:ind w:left="720" w:hanging="360"/>
+      </w:pPr>
+      <w:rPr>
+        <w:rFonts w:ascii="Symbol" w:hAnsi="Symbol" w:hint="default"/>
+      </w:rPr>
+    </w:lvl>
+    <w:lvl w:ilvl="1" w:tplc="04090003" w:tentative="1">
+      <w:start w:val="1"/>
+      <w:numFmt w:val="bullet"/>
+      <w:lvlText w:val="o"/>
+      <w:lvlJc w:val="left"/>
+      <w:pPr>
+        <w:ind w:left="1440" w:hanging="360"/>
+      </w:pPr>
+      <w:rPr>
+        <w:rFonts w:ascii="Courier New" w:hAnsi="Courier New" w:cs="Courier New" w:hint="default"/>
+      </w:rPr>
+    </w:lvl>
+    <w:lvl w:ilvl="2" w:tplc="04090005" w:tentative="1">
+      <w:start w:val="1"/>
+      <w:numFmt w:val="bullet"/>
+      <w:lvlText w:val=""/>
+      <w:lvlJc w:val="left"/>
+      <w:pPr>
+        <w:ind w:left="2160" w:hanging="360"/>
+      </w:pPr>
+      <w:rPr>
+        <w:rFonts w:ascii="Wingdings" w:hAnsi="Wingdings" w:hint="default"/>
+      </w:rPr>
+    </w:lvl>
+    <w:lvl w:ilvl="3" w:tplc="04090001" w:tentative="1">
+      <w:start w:val="1"/>
+      <w:numFmt w:val="bullet"/>
+      <w:lvlText w:val=""/>
+      <w:lvlJc w:val="left"/>
+      <w:pPr>
+        <w:ind w:left="2880" w:hanging="360"/>
+      </w:pPr>
+      <w:rPr>
+        <w:rFonts w:ascii="Symbol" w:hAnsi="Symbol" w:hint="default"/>
+      </w:rPr>
+    </w:lvl>
+    <w:lvl w:ilvl="4" w:tplc="04090003" w:tentative="1">
+      <w:start w:val="1"/>
+      <w:numFmt w:val="bullet"/>
+      <w:lvlText w:val="o"/>
+      <w:lvlJc w:val="left"/>
+      <w:pPr>
+        <w:ind w:left="3600" w:hanging="360"/>
+      </w:pPr>
+      <w:rPr>
+        <w:rFonts w:ascii="Courier New" w:hAnsi="Courier New" w:cs="Courier New" w:hint="default"/>
+      </w:rPr>
+    </w:lvl>
+    <w:lvl w:ilvl="5" w:tplc="04090005" w:tentative="1">
+      <w:start w:val="1"/>
+      <w:numFmt w:val="bullet"/>
+      <w:lvlText w:val=""/>
+      <w:lvlJc w:val="left"/>
+      <w:pPr>
+        <w:ind w:left="4320" w:hanging="360"/>
+      </w:pPr>
+      <w:rPr>
+        <w:rFonts w:ascii="Wingdings" w:hAnsi="Wingdings" w:hint="default"/>
+      </w:rPr>
+    </w:lvl>
+    <w:lvl w:ilvl="6" w:tplc="04090001" w:tentative="1">
+      <w:start w:val="1"/>
+      <w:numFmt w:val="bullet"/>
+      <w:lvlText w:val=""/>
+      <w:lvlJc w:val="left"/>
+      <w:pPr>
+        <w:ind w:left="5040" w:hanging="360"/>
+      </w:pPr>
+      <w:rPr>
+        <w:rFonts w:ascii="Symbol" w:hAnsi="Symbol" w:hint="default"/>
+      </w:rPr>
+    </w:lvl>
+    <w:lvl w:ilvl="7" w:tplc="04090003" w:tentative="1">
+      <w:start w:val="1"/>
+      <w:numFmt w:val="bullet"/>
+      <w:lvlText w:val="o"/>
+      <w:lvlJc w:val="left"/>
+      <w:pPr>
+        <w:ind w:left="5760" w:hanging="360"/>
+      </w:pPr>
+      <w:rPr>
+        <w:rFonts w:ascii="Courier New" w:hAnsi="Courier New" w:cs="Courier New" w:hint="default"/>
+      </w:rPr>
+    </w:lvl>
+    <w:lvl w:ilvl="8" w:tplc="04090005" w:tentative="1">
+      <w:start w:val="1"/>
+      <w:numFmt w:val="bullet"/>
+      <w:lvlText w:val=""/>
+      <w:lvlJc w:val="left"/>
+      <w:pPr>
+        <w:ind w:left="6480" w:hanging="360"/>
+      </w:pPr>
+      <w:rPr>
+        <w:rFonts w:ascii="Wingdings" w:hAnsi="Wingdings" w:hint="default"/>
+      </w:rPr>
+    </w:lvl>
+  </w:abstractNum>
+  <w:abstractNum w:abstractNumId="9" w15:restartNumberingAfterBreak="0">
     <w:nsid w:val="1AF31C2C"/>
     <w:multiLevelType w:val="multilevel"/>
     <w:tmpl w:val="FC90B5DC"/>
@@ -4847,7 +5140,7 @@
       </w:rPr>
     </w:lvl>
   </w:abstractNum>
-  <w:abstractNum w:abstractNumId="9" w15:restartNumberingAfterBreak="0">
+  <w:abstractNum w:abstractNumId="10" w15:restartNumberingAfterBreak="0">
     <w:nsid w:val="1B9E30C8"/>
     <w:multiLevelType w:val="multilevel"/>
     <w:tmpl w:val="327E6390"/>
@@ -4960,7 +5253,7 @@
       </w:pPr>
     </w:lvl>
   </w:abstractNum>
-  <w:abstractNum w:abstractNumId="10" w15:restartNumberingAfterBreak="0">
+  <w:abstractNum w:abstractNumId="11" w15:restartNumberingAfterBreak="0">
     <w:nsid w:val="1FE01408"/>
     <w:multiLevelType w:val="multilevel"/>
     <w:tmpl w:val="6654360A"/>
@@ -5109,7 +5402,7 @@
       </w:rPr>
     </w:lvl>
   </w:abstractNum>
-  <w:abstractNum w:abstractNumId="11" w15:restartNumberingAfterBreak="0">
+  <w:abstractNum w:abstractNumId="12" w15:restartNumberingAfterBreak="0">
     <w:nsid w:val="281E35BA"/>
     <w:multiLevelType w:val="hybridMultilevel"/>
     <w:tmpl w:val="FA90066C"/>
@@ -5198,7 +5491,120 @@
       </w:pPr>
     </w:lvl>
   </w:abstractNum>
-  <w:abstractNum w:abstractNumId="12" w15:restartNumberingAfterBreak="0">
+  <w:abstractNum w:abstractNumId="13" w15:restartNumberingAfterBreak="0">
+    <w:nsid w:val="340F5300"/>
+    <w:multiLevelType w:val="hybridMultilevel"/>
+    <w:tmpl w:val="B7968FCC"/>
+    <w:lvl w:ilvl="0" w:tplc="04090001">
+      <w:start w:val="1"/>
+      <w:numFmt w:val="bullet"/>
+      <w:lvlText w:val=""/>
+      <w:lvlJc w:val="left"/>
+      <w:pPr>
+        <w:ind w:left="1440" w:hanging="360"/>
+      </w:pPr>
+      <w:rPr>
+        <w:rFonts w:ascii="Symbol" w:hAnsi="Symbol" w:hint="default"/>
+      </w:rPr>
+    </w:lvl>
+    <w:lvl w:ilvl="1" w:tplc="04090003" w:tentative="1">
+      <w:start w:val="1"/>
+      <w:numFmt w:val="bullet"/>
+      <w:lvlText w:val="o"/>
+      <w:lvlJc w:val="left"/>
+      <w:pPr>
+        <w:ind w:left="2160" w:hanging="360"/>
+      </w:pPr>
+      <w:rPr>
+        <w:rFonts w:ascii="Courier New" w:hAnsi="Courier New" w:cs="Courier New" w:hint="default"/>
+      </w:rPr>
+    </w:lvl>
+    <w:lvl w:ilvl="2" w:tplc="04090005" w:tentative="1">
+      <w:start w:val="1"/>
+      <w:numFmt w:val="bullet"/>
+      <w:lvlText w:val=""/>
+      <w:lvlJc w:val="left"/>
+      <w:pPr>
+        <w:ind w:left="2880" w:hanging="360"/>
+      </w:pPr>
+      <w:rPr>
+        <w:rFonts w:ascii="Wingdings" w:hAnsi="Wingdings" w:hint="default"/>
+      </w:rPr>
+    </w:lvl>
+    <w:lvl w:ilvl="3" w:tplc="04090001" w:tentative="1">
+      <w:start w:val="1"/>
+      <w:numFmt w:val="bullet"/>
+      <w:lvlText w:val=""/>
+      <w:lvlJc w:val="left"/>
+      <w:pPr>
+        <w:ind w:left="3600" w:hanging="360"/>
+      </w:pPr>
+      <w:rPr>
+        <w:rFonts w:ascii="Symbol" w:hAnsi="Symbol" w:hint="default"/>
+      </w:rPr>
+    </w:lvl>
+    <w:lvl w:ilvl="4" w:tplc="04090003" w:tentative="1">
+      <w:start w:val="1"/>
+      <w:numFmt w:val="bullet"/>
+      <w:lvlText w:val="o"/>
+      <w:lvlJc w:val="left"/>
+      <w:pPr>
+        <w:ind w:left="4320" w:hanging="360"/>
+      </w:pPr>
+      <w:rPr>
+        <w:rFonts w:ascii="Courier New" w:hAnsi="Courier New" w:cs="Courier New" w:hint="default"/>
+      </w:rPr>
+    </w:lvl>
+    <w:lvl w:ilvl="5" w:tplc="04090005" w:tentative="1">
+      <w:start w:val="1"/>
+      <w:numFmt w:val="bullet"/>
+      <w:lvlText w:val=""/>
+      <w:lvlJc w:val="left"/>
+      <w:pPr>
+        <w:ind w:left="5040" w:hanging="360"/>
+      </w:pPr>
+      <w:rPr>
+        <w:rFonts w:ascii="Wingdings" w:hAnsi="Wingdings" w:hint="default"/>
+      </w:rPr>
+    </w:lvl>
+    <w:lvl w:ilvl="6" w:tplc="04090001" w:tentative="1">
+      <w:start w:val="1"/>
+      <w:numFmt w:val="bullet"/>
+      <w:lvlText w:val=""/>
+      <w:lvlJc w:val="left"/>
+      <w:pPr>
+        <w:ind w:left="5760" w:hanging="360"/>
+      </w:pPr>
+      <w:rPr>
+        <w:rFonts w:ascii="Symbol" w:hAnsi="Symbol" w:hint="default"/>
+      </w:rPr>
+    </w:lvl>
+    <w:lvl w:ilvl="7" w:tplc="04090003" w:tentative="1">
+      <w:start w:val="1"/>
+      <w:numFmt w:val="bullet"/>
+      <w:lvlText w:val="o"/>
+      <w:lvlJc w:val="left"/>
+      <w:pPr>
+        <w:ind w:left="6480" w:hanging="360"/>
+      </w:pPr>
+      <w:rPr>
+        <w:rFonts w:ascii="Courier New" w:hAnsi="Courier New" w:cs="Courier New" w:hint="default"/>
+      </w:rPr>
+    </w:lvl>
+    <w:lvl w:ilvl="8" w:tplc="04090005" w:tentative="1">
+      <w:start w:val="1"/>
+      <w:numFmt w:val="bullet"/>
+      <w:lvlText w:val=""/>
+      <w:lvlJc w:val="left"/>
+      <w:pPr>
+        <w:ind w:left="7200" w:hanging="360"/>
+      </w:pPr>
+      <w:rPr>
+        <w:rFonts w:ascii="Wingdings" w:hAnsi="Wingdings" w:hint="default"/>
+      </w:rPr>
+    </w:lvl>
+  </w:abstractNum>
+  <w:abstractNum w:abstractNumId="14" w15:restartNumberingAfterBreak="0">
     <w:nsid w:val="35D7268C"/>
     <w:multiLevelType w:val="multilevel"/>
     <w:tmpl w:val="F4589056"/>
@@ -5311,7 +5717,7 @@
       </w:pPr>
     </w:lvl>
   </w:abstractNum>
-  <w:abstractNum w:abstractNumId="13" w15:restartNumberingAfterBreak="0">
+  <w:abstractNum w:abstractNumId="15" w15:restartNumberingAfterBreak="0">
     <w:nsid w:val="3A591756"/>
     <w:multiLevelType w:val="multilevel"/>
     <w:tmpl w:val="EE2EE81E"/>
@@ -5427,7 +5833,7 @@
       </w:pPr>
     </w:lvl>
   </w:abstractNum>
-  <w:abstractNum w:abstractNumId="14" w15:restartNumberingAfterBreak="0">
+  <w:abstractNum w:abstractNumId="16" w15:restartNumberingAfterBreak="0">
     <w:nsid w:val="42B56C69"/>
     <w:multiLevelType w:val="multilevel"/>
     <w:tmpl w:val="A166301E"/>
@@ -5540,7 +5946,7 @@
       </w:pPr>
     </w:lvl>
   </w:abstractNum>
-  <w:abstractNum w:abstractNumId="15" w15:restartNumberingAfterBreak="0">
+  <w:abstractNum w:abstractNumId="17" w15:restartNumberingAfterBreak="0">
     <w:nsid w:val="45355631"/>
     <w:multiLevelType w:val="multilevel"/>
     <w:tmpl w:val="C8F28B28"/>
@@ -5653,7 +6059,7 @@
       </w:pPr>
     </w:lvl>
   </w:abstractNum>
-  <w:abstractNum w:abstractNumId="16" w15:restartNumberingAfterBreak="0">
+  <w:abstractNum w:abstractNumId="18" w15:restartNumberingAfterBreak="0">
     <w:nsid w:val="45EE0737"/>
     <w:multiLevelType w:val="multilevel"/>
     <w:tmpl w:val="F68C13DE"/>
@@ -5766,7 +6172,7 @@
       </w:pPr>
     </w:lvl>
   </w:abstractNum>
-  <w:abstractNum w:abstractNumId="17" w15:restartNumberingAfterBreak="0">
+  <w:abstractNum w:abstractNumId="19" w15:restartNumberingAfterBreak="0">
     <w:nsid w:val="49157057"/>
     <w:multiLevelType w:val="multilevel"/>
     <w:tmpl w:val="133EA1EE"/>
@@ -5906,7 +6312,7 @@
       </w:rPr>
     </w:lvl>
   </w:abstractNum>
-  <w:abstractNum w:abstractNumId="18" w15:restartNumberingAfterBreak="0">
+  <w:abstractNum w:abstractNumId="20" w15:restartNumberingAfterBreak="0">
     <w:nsid w:val="57716062"/>
     <w:multiLevelType w:val="hybridMultilevel"/>
     <w:tmpl w:val="720EFCCA"/>
@@ -5992,7 +6398,7 @@
       </w:pPr>
     </w:lvl>
   </w:abstractNum>
-  <w:abstractNum w:abstractNumId="19" w15:restartNumberingAfterBreak="0">
+  <w:abstractNum w:abstractNumId="21" w15:restartNumberingAfterBreak="0">
     <w:nsid w:val="58347942"/>
     <w:multiLevelType w:val="multilevel"/>
     <w:tmpl w:val="7CDC6A5C"/>
@@ -6105,7 +6511,7 @@
       </w:pPr>
     </w:lvl>
   </w:abstractNum>
-  <w:abstractNum w:abstractNumId="20" w15:restartNumberingAfterBreak="0">
+  <w:abstractNum w:abstractNumId="22" w15:restartNumberingAfterBreak="0">
     <w:nsid w:val="59D336AC"/>
     <w:multiLevelType w:val="multilevel"/>
     <w:tmpl w:val="40CC24FE"/>
@@ -6231,7 +6637,7 @@
       </w:pPr>
     </w:lvl>
   </w:abstractNum>
-  <w:abstractNum w:abstractNumId="21" w15:restartNumberingAfterBreak="0">
+  <w:abstractNum w:abstractNumId="23" w15:restartNumberingAfterBreak="0">
     <w:nsid w:val="5BF51AB1"/>
     <w:multiLevelType w:val="multilevel"/>
     <w:tmpl w:val="36F832D2"/>
@@ -6344,7 +6750,120 @@
       </w:pPr>
     </w:lvl>
   </w:abstractNum>
-  <w:abstractNum w:abstractNumId="22" w15:restartNumberingAfterBreak="0">
+  <w:abstractNum w:abstractNumId="24" w15:restartNumberingAfterBreak="0">
+    <w:nsid w:val="60E924FF"/>
+    <w:multiLevelType w:val="hybridMultilevel"/>
+    <w:tmpl w:val="84845946"/>
+    <w:lvl w:ilvl="0" w:tplc="04090001">
+      <w:start w:val="1"/>
+      <w:numFmt w:val="bullet"/>
+      <w:lvlText w:val=""/>
+      <w:lvlJc w:val="left"/>
+      <w:pPr>
+        <w:ind w:left="720" w:hanging="360"/>
+      </w:pPr>
+      <w:rPr>
+        <w:rFonts w:ascii="Symbol" w:hAnsi="Symbol" w:hint="default"/>
+      </w:rPr>
+    </w:lvl>
+    <w:lvl w:ilvl="1" w:tplc="04090003" w:tentative="1">
+      <w:start w:val="1"/>
+      <w:numFmt w:val="bullet"/>
+      <w:lvlText w:val="o"/>
+      <w:lvlJc w:val="left"/>
+      <w:pPr>
+        <w:ind w:left="1440" w:hanging="360"/>
+      </w:pPr>
+      <w:rPr>
+        <w:rFonts w:ascii="Courier New" w:hAnsi="Courier New" w:cs="Courier New" w:hint="default"/>
+      </w:rPr>
+    </w:lvl>
+    <w:lvl w:ilvl="2" w:tplc="04090005" w:tentative="1">
+      <w:start w:val="1"/>
+      <w:numFmt w:val="bullet"/>
+      <w:lvlText w:val=""/>
+      <w:lvlJc w:val="left"/>
+      <w:pPr>
+        <w:ind w:left="2160" w:hanging="360"/>
+      </w:pPr>
+      <w:rPr>
+        <w:rFonts w:ascii="Wingdings" w:hAnsi="Wingdings" w:hint="default"/>
+      </w:rPr>
+    </w:lvl>
+    <w:lvl w:ilvl="3" w:tplc="04090001" w:tentative="1">
+      <w:start w:val="1"/>
+      <w:numFmt w:val="bullet"/>
+      <w:lvlText w:val=""/>
+      <w:lvlJc w:val="left"/>
+      <w:pPr>
+        <w:ind w:left="2880" w:hanging="360"/>
+      </w:pPr>
+      <w:rPr>
+        <w:rFonts w:ascii="Symbol" w:hAnsi="Symbol" w:hint="default"/>
+      </w:rPr>
+    </w:lvl>
+    <w:lvl w:ilvl="4" w:tplc="04090003" w:tentative="1">
+      <w:start w:val="1"/>
+      <w:numFmt w:val="bullet"/>
+      <w:lvlText w:val="o"/>
+      <w:lvlJc w:val="left"/>
+      <w:pPr>
+        <w:ind w:left="3600" w:hanging="360"/>
+      </w:pPr>
+      <w:rPr>
+        <w:rFonts w:ascii="Courier New" w:hAnsi="Courier New" w:cs="Courier New" w:hint="default"/>
+      </w:rPr>
+    </w:lvl>
+    <w:lvl w:ilvl="5" w:tplc="04090005" w:tentative="1">
+      <w:start w:val="1"/>
+      <w:numFmt w:val="bullet"/>
+      <w:lvlText w:val=""/>
+      <w:lvlJc w:val="left"/>
+      <w:pPr>
+        <w:ind w:left="4320" w:hanging="360"/>
+      </w:pPr>
+      <w:rPr>
+        <w:rFonts w:ascii="Wingdings" w:hAnsi="Wingdings" w:hint="default"/>
+      </w:rPr>
+    </w:lvl>
+    <w:lvl w:ilvl="6" w:tplc="04090001" w:tentative="1">
+      <w:start w:val="1"/>
+      <w:numFmt w:val="bullet"/>
+      <w:lvlText w:val=""/>
+      <w:lvlJc w:val="left"/>
+      <w:pPr>
+        <w:ind w:left="5040" w:hanging="360"/>
+      </w:pPr>
+      <w:rPr>
+        <w:rFonts w:ascii="Symbol" w:hAnsi="Symbol" w:hint="default"/>
+      </w:rPr>
+    </w:lvl>
+    <w:lvl w:ilvl="7" w:tplc="04090003" w:tentative="1">
+      <w:start w:val="1"/>
+      <w:numFmt w:val="bullet"/>
+      <w:lvlText w:val="o"/>
+      <w:lvlJc w:val="left"/>
+      <w:pPr>
+        <w:ind w:left="5760" w:hanging="360"/>
+      </w:pPr>
+      <w:rPr>
+        <w:rFonts w:ascii="Courier New" w:hAnsi="Courier New" w:cs="Courier New" w:hint="default"/>
+      </w:rPr>
+    </w:lvl>
+    <w:lvl w:ilvl="8" w:tplc="04090005" w:tentative="1">
+      <w:start w:val="1"/>
+      <w:numFmt w:val="bullet"/>
+      <w:lvlText w:val=""/>
+      <w:lvlJc w:val="left"/>
+      <w:pPr>
+        <w:ind w:left="6480" w:hanging="360"/>
+      </w:pPr>
+      <w:rPr>
+        <w:rFonts w:ascii="Wingdings" w:hAnsi="Wingdings" w:hint="default"/>
+      </w:rPr>
+    </w:lvl>
+  </w:abstractNum>
+  <w:abstractNum w:abstractNumId="25" w15:restartNumberingAfterBreak="0">
     <w:nsid w:val="61CB7C38"/>
     <w:multiLevelType w:val="multilevel"/>
     <w:tmpl w:val="94921536"/>
@@ -6466,7 +6985,7 @@
       </w:pPr>
     </w:lvl>
   </w:abstractNum>
-  <w:abstractNum w:abstractNumId="23" w15:restartNumberingAfterBreak="0">
+  <w:abstractNum w:abstractNumId="26" w15:restartNumberingAfterBreak="0">
     <w:nsid w:val="62053529"/>
     <w:multiLevelType w:val="multilevel"/>
     <w:tmpl w:val="3BD015EE"/>
@@ -6606,7 +7125,7 @@
       </w:rPr>
     </w:lvl>
   </w:abstractNum>
-  <w:abstractNum w:abstractNumId="24" w15:restartNumberingAfterBreak="0">
+  <w:abstractNum w:abstractNumId="27" w15:restartNumberingAfterBreak="0">
     <w:nsid w:val="662B5B36"/>
     <w:multiLevelType w:val="multilevel"/>
     <w:tmpl w:val="CA326C82"/>
@@ -6746,7 +7265,7 @@
       </w:rPr>
     </w:lvl>
   </w:abstractNum>
-  <w:abstractNum w:abstractNumId="25" w15:restartNumberingAfterBreak="0">
+  <w:abstractNum w:abstractNumId="28" w15:restartNumberingAfterBreak="0">
     <w:nsid w:val="762C4B95"/>
     <w:multiLevelType w:val="hybridMultilevel"/>
     <w:tmpl w:val="60565E82"/>
@@ -6860,7 +7379,7 @@
     </w:lvl>
   </w:abstractNum>
   <w:num w:numId="1" w16cid:durableId="1949661245">
-    <w:abstractNumId w:val="20"/>
+    <w:abstractNumId w:val="22"/>
   </w:num>
   <w:num w:numId="2" w16cid:durableId="975186037">
     <w:abstractNumId w:val="7"/>
@@ -6875,16 +7394,16 @@
     <w:abstractNumId w:val="3"/>
   </w:num>
   <w:num w:numId="6" w16cid:durableId="643968685">
-    <w:abstractNumId w:val="8"/>
+    <w:abstractNumId w:val="9"/>
   </w:num>
   <w:num w:numId="7" w16cid:durableId="1368724835">
-    <w:abstractNumId w:val="15"/>
+    <w:abstractNumId w:val="17"/>
   </w:num>
   <w:num w:numId="8" w16cid:durableId="490827008">
-    <w:abstractNumId w:val="14"/>
+    <w:abstractNumId w:val="16"/>
   </w:num>
   <w:num w:numId="9" w16cid:durableId="975570213">
-    <w:abstractNumId w:val="21"/>
+    <w:abstractNumId w:val="23"/>
   </w:num>
   <w:num w:numId="10" w16cid:durableId="747847668">
     <w:abstractNumId w:val="6"/>
@@ -6893,64 +7412,73 @@
     <w:abstractNumId w:val="4"/>
   </w:num>
   <w:num w:numId="12" w16cid:durableId="993683310">
-    <w:abstractNumId w:val="19"/>
+    <w:abstractNumId w:val="21"/>
   </w:num>
   <w:num w:numId="13" w16cid:durableId="1799763867">
     <w:abstractNumId w:val="5"/>
   </w:num>
   <w:num w:numId="14" w16cid:durableId="66467078">
-    <w:abstractNumId w:val="9"/>
+    <w:abstractNumId w:val="10"/>
   </w:num>
   <w:num w:numId="15" w16cid:durableId="1855537364">
-    <w:abstractNumId w:val="17"/>
+    <w:abstractNumId w:val="19"/>
   </w:num>
   <w:num w:numId="16" w16cid:durableId="2052419870">
-    <w:abstractNumId w:val="13"/>
+    <w:abstractNumId w:val="15"/>
   </w:num>
   <w:num w:numId="17" w16cid:durableId="2115586065">
-    <w:abstractNumId w:val="23"/>
+    <w:abstractNumId w:val="26"/>
   </w:num>
   <w:num w:numId="18" w16cid:durableId="889801263">
-    <w:abstractNumId w:val="24"/>
+    <w:abstractNumId w:val="27"/>
   </w:num>
   <w:num w:numId="19" w16cid:durableId="1331986338">
+    <w:abstractNumId w:val="25"/>
+  </w:num>
+  <w:num w:numId="20" w16cid:durableId="1740715814">
+    <w:abstractNumId w:val="12"/>
+  </w:num>
+  <w:num w:numId="21" w16cid:durableId="324822862">
+    <w:abstractNumId w:val="28"/>
+  </w:num>
+  <w:num w:numId="22" w16cid:durableId="940600349">
+    <w:abstractNumId w:val="11"/>
+  </w:num>
+  <w:num w:numId="23" w16cid:durableId="941302547">
     <w:abstractNumId w:val="22"/>
   </w:num>
-  <w:num w:numId="20" w16cid:durableId="1740715814">
-    <w:abstractNumId w:val="11"/>
-  </w:num>
-  <w:num w:numId="21" w16cid:durableId="324822862">
-    <w:abstractNumId w:val="25"/>
-  </w:num>
-  <w:num w:numId="22" w16cid:durableId="940600349">
-    <w:abstractNumId w:val="10"/>
-  </w:num>
-  <w:num w:numId="23" w16cid:durableId="941302547">
-    <w:abstractNumId w:val="20"/>
-  </w:num>
   <w:num w:numId="24" w16cid:durableId="232590705">
-    <w:abstractNumId w:val="20"/>
+    <w:abstractNumId w:val="22"/>
   </w:num>
   <w:num w:numId="25" w16cid:durableId="828012013">
-    <w:abstractNumId w:val="20"/>
+    <w:abstractNumId w:val="22"/>
   </w:num>
   <w:num w:numId="26" w16cid:durableId="55859948">
-    <w:abstractNumId w:val="20"/>
+    <w:abstractNumId w:val="22"/>
   </w:num>
   <w:num w:numId="27" w16cid:durableId="1781486404">
-    <w:abstractNumId w:val="12"/>
+    <w:abstractNumId w:val="14"/>
   </w:num>
   <w:num w:numId="28" w16cid:durableId="1431926630">
-    <w:abstractNumId w:val="16"/>
+    <w:abstractNumId w:val="18"/>
   </w:num>
   <w:num w:numId="29" w16cid:durableId="2070029894">
-    <w:abstractNumId w:val="20"/>
+    <w:abstractNumId w:val="22"/>
   </w:num>
   <w:num w:numId="30" w16cid:durableId="417100456">
-    <w:abstractNumId w:val="18"/>
+    <w:abstractNumId w:val="20"/>
   </w:num>
   <w:num w:numId="31" w16cid:durableId="1814181327">
     <w:abstractNumId w:val="2"/>
+  </w:num>
+  <w:num w:numId="32" w16cid:durableId="30226704">
+    <w:abstractNumId w:val="24"/>
+  </w:num>
+  <w:num w:numId="33" w16cid:durableId="817309899">
+    <w:abstractNumId w:val="13"/>
+  </w:num>
+  <w:num w:numId="34" w16cid:durableId="1925719122">
+    <w:abstractNumId w:val="8"/>
   </w:num>
 </w:numbering>
 </file>
@@ -7437,7 +7965,6 @@
   <w:style w:type="character" w:default="1" w:styleId="DefaultParagraphFont">
     <w:name w:val="Default Paragraph Font"/>
     <w:uiPriority w:val="1"/>
-    <w:semiHidden/>
     <w:unhideWhenUsed/>
   </w:style>
   <w:style w:type="table" w:default="1" w:styleId="TableNormal">

</xml_diff>